<commit_message>
Agrega contacto de El Grupo en sección 6 del contrato
</commit_message>
<xml_diff>
--- a/doc_templates/plantilla_acuerdo_confidencialidad.docx
+++ b/doc_templates/plantilla_acuerdo_confidencialidad.docx
@@ -605,7 +605,7 @@
                 <w:sz w:val="24"/>
                 <w:szCs w:val="24"/>
               </w:rPr>
-              <w:t xml:space="preserve">Nombre: </w:t>
+              <w:t>- Nombre: {NOMBRE REP EL GRUPO}</w:t>
             </w:r>
           </w:p>
           <w:p>
@@ -622,7 +622,7 @@
                 <w:sz w:val="24"/>
                 <w:szCs w:val="24"/>
               </w:rPr>
-              <w:t xml:space="preserve">Teléfono: </w:t>
+              <w:t>- Teléfono: {TELEFONO REP EL GRUPO}</w:t>
             </w:r>
           </w:p>
           <w:p>
@@ -639,7 +639,7 @@
                 <w:sz w:val="24"/>
                 <w:szCs w:val="24"/>
               </w:rPr>
-              <w:t xml:space="preserve">Dirección: </w:t>
+              <w:t>- Dirección: {DIRECCION REP EL GRUPO}</w:t>
             </w:r>
           </w:p>
           <w:p>
@@ -656,7 +656,15 @@
                 <w:sz w:val="24"/>
                 <w:szCs w:val="24"/>
               </w:rPr>
-              <w:t xml:space="preserve">Correo Electrónico: </w:t>
+              <w:t xml:space="preserve">- Correo Electrónico: {EMAIL REP EL GRUPO} </w:t>
+            </w:r>
+            <w:r>
+              <w:rPr>
+                <w:rFonts w:ascii="Arial" w:eastAsia="Arial" w:hAnsi="Arial" w:cs="Arial"/>
+                <w:sz w:val="24"/>
+                <w:szCs w:val="24"/>
+              </w:rPr>
+              <w:t xml:space="preserve"> </w:t>
             </w:r>
           </w:p>
           <w:p>
@@ -717,15 +725,7 @@
                 <w:sz w:val="24"/>
                 <w:szCs w:val="24"/>
               </w:rPr>
-              <w:t>{</w:t>
-            </w:r>
-            <w:r>
-              <w:rPr>
-                <w:rFonts w:ascii="Arial" w:eastAsia="Arial" w:hAnsi="Arial" w:cs="Arial"/>
-                <w:sz w:val="24"/>
-                <w:szCs w:val="24"/>
-              </w:rPr>
-              <w:t>NOMBRE REPRESENTANTE LEGAL CONTRATISTA}</w:t>
+              <w:t>{NOMBRE REPRESENTANTE LEGAL CONTRATISTA}</w:t>
             </w:r>
           </w:p>
           <w:p>

</xml_diff>